<commit_message>
Update submission files, dashboard and citation
</commit_message>
<xml_diff>
--- a/submission/Cover_Letter.docx
+++ b/submission/Cover_Letter.docx
@@ -24,7 +24,7 @@
         <w:t xml:space="preserve">“</w:t>
       </w:r>
       <w:r>
-        <w:t xml:space="preserve">Can Satellite Vegetation Data Attribute War-Time Environmental Damage to a Single Event? A Difference-in-Differences Test of the Kakhovka Dam Destruction</w:t>
+        <w:t xml:space="preserve">Flood, Irrigation Loss or War? A Pre-Registered, Exposure-Based Satellite Test of the Vegetation Effects of the Kakhovka Dam Destruction</w:t>
       </w:r>
       <w:r>
         <w:t xml:space="preserve">”</w:t>
@@ -40,7 +40,7 @@
           <w:iCs/>
           <w:i/>
         </w:rPr>
-        <w:t xml:space="preserve">Environment and Security</w:t>
+        <w:t xml:space="preserve">[Journal name]</w:t>
       </w:r>
       <w:r>
         <w:t xml:space="preserve">.</w:t>
@@ -51,7 +51,7 @@
         <w:pStyle w:val="BodyText"/>
       </w:pPr>
       <w:r>
-        <w:t xml:space="preserve">Satellite imagery is increasingly offered as evidence of conflict-related environmental harm, and a standalone crime of ecocide has been proposed for the Rome Statute. This study asks whether a counterfactual design can attribute vegetation change to one dated act of war — the destruction of the Kakhovka Dam in June 2023 — by comparing Kherson Oblast with four Romanian counties and subjecting the estimate to placebo tests, an event study, randomization inference and a control-only divergence check. It finds a statistically significant, seasonally robust relative decline in Kherson’s vegetation after the event, but also that the design cannot attribute it to the dam: one control region shifts by as much and pre-event trends deviate. This distinction between a significant satellite signal and an event-attributable one is, I believe, useful to the journal’s readers because it shows, with fully reproducible code, which conditions make satellite evidence of war-time environmental damage hold up or fail.</w:t>
+        <w:t xml:space="preserve">Satellite imagery is increasingly offered as evidence of environmental harm in armed conflict, and a crime of ecocide has been proposed for the Rome Statute. Most satellite assessments, however, compare administrative areas before and after an event and cannot separate one act from the war around it.</w:t>
       </w:r>
     </w:p>
     <w:p>
@@ -59,7 +59,79 @@
         <w:pStyle w:val="BodyText"/>
       </w:pPr>
       <w:r>
-        <w:t xml:space="preserve">An earlier version of this work, with results superseded by corrections described in the manuscript, was posted on EarthArXiv [preprint DOI]. The manuscript is not under consideration elsewhere. AI tools were used for code review, auditing and language editing, as disclosed in the Acknowledgements.</w:t>
+        <w:t xml:space="preserve">This study takes the destruction of the Kakhovka Dam in June 2023 and separates its three physical pathways: the flood, the drained reservoir and the loss of canal irrigation. It does this with 250 m MODIS data from 2010–2024, treatment defined by physical exposure, and comparisons made inside the war zone. Every analytical choice, including the decision rule for calling a hypothesis supported, was fixed in a public analysis plan before any data were downloaded. A registered revision, committed before its additional data were obtained, addressed problems that the first results exposed.</w:t>
+      </w:r>
+    </w:p>
+    <w:p>
+      <w:pPr>
+        <w:pStyle w:val="BodyText"/>
+      </w:pPr>
+      <w:r>
+        <w:t xml:space="preserve">The findings are specific:</w:t>
+      </w:r>
+    </w:p>
+    <w:p>
+      <w:pPr>
+        <w:numPr>
+          <w:ilvl w:val="0"/>
+          <w:numId w:val="1001"/>
+        </w:numPr>
+        <w:pStyle w:val="Compact"/>
+      </w:pPr>
+      <w:r>
+        <w:t xml:space="preserve">Flooded land did not lose summer greenness, except for floodplain wetlands.</w:t>
+      </w:r>
+    </w:p>
+    <w:p>
+      <w:pPr>
+        <w:numPr>
+          <w:ilvl w:val="0"/>
+          <w:numId w:val="1001"/>
+        </w:numPr>
+        <w:pStyle w:val="Compact"/>
+      </w:pPr>
+      <w:r>
+        <w:t xml:space="preserve">The apparent decline of canal-irrigated farmland predates the invasion, and did not change after the breach once occupation and conflict intensity are accounted for.</w:t>
+      </w:r>
+    </w:p>
+    <w:p>
+      <w:pPr>
+        <w:numPr>
+          <w:ilvl w:val="0"/>
+          <w:numId w:val="1001"/>
+        </w:numPr>
+        <w:pStyle w:val="Compact"/>
+      </w:pPr>
+      <w:r>
+        <w:t xml:space="preserve">About 1,500 km² of the former reservoir became vegetated within two seasons.</w:t>
+      </w:r>
+    </w:p>
+    <w:p>
+      <w:pPr>
+        <w:numPr>
+          <w:ilvl w:val="0"/>
+          <w:numId w:val="1001"/>
+        </w:numPr>
+        <w:pStyle w:val="Compact"/>
+      </w:pPr>
+      <w:r>
+        <w:t xml:space="preserve">Most of the oblast-wide decline reported by an earlier, administrative-unit version of this study came from land outside all three pathways.</w:t>
+      </w:r>
+    </w:p>
+    <w:p>
+      <w:pPr>
+        <w:pStyle w:val="FirstParagraph"/>
+      </w:pPr>
+      <w:r>
+        <w:t xml:space="preserve">I believe the paper will interest the journal’s readers because it shows, with fully reproducible code, what satellite evidence can and cannot attribute to a single act of war.</w:t>
+      </w:r>
+    </w:p>
+    <w:p>
+      <w:pPr>
+        <w:pStyle w:val="BodyText"/>
+      </w:pPr>
+      <w:r>
+        <w:t xml:space="preserve">An earlier version of this work, with a different design and superseded results, was posted on EarthArXiv [preprint DOI]. The manuscript is not under consideration elsewhere. AI tools were used for code writing and review, auditing and language editing, as disclosed in the Acknowledgements.</w:t>
       </w:r>
     </w:p>
     <w:p>
@@ -182,8 +254,87 @@
       </w:pPr>
     </w:lvl>
   </w:abstractNum>
+  <w:abstractNum w:abstractNumId="991">
+    <w:nsid w:val="A991"/>
+    <w:multiLevelType w:val="multilevel"/>
+    <w:lvl w:ilvl="0">
+      <w:numFmt w:val="bullet"/>
+      <w:lvlText w:val="•"/>
+      <w:lvlJc w:val="left"/>
+      <w:pPr>
+        <w:ind w:left="720" w:hanging="480"/>
+      </w:pPr>
+    </w:lvl>
+    <w:lvl w:ilvl="1">
+      <w:numFmt w:val="bullet"/>
+      <w:lvlText w:val="–"/>
+      <w:lvlJc w:val="left"/>
+      <w:pPr>
+        <w:ind w:left="1440" w:hanging="480"/>
+      </w:pPr>
+    </w:lvl>
+    <w:lvl w:ilvl="2">
+      <w:numFmt w:val="bullet"/>
+      <w:lvlText w:val="•"/>
+      <w:lvlJc w:val="left"/>
+      <w:pPr>
+        <w:ind w:left="2160" w:hanging="480"/>
+      </w:pPr>
+    </w:lvl>
+    <w:lvl w:ilvl="3">
+      <w:numFmt w:val="bullet"/>
+      <w:lvlText w:val="–"/>
+      <w:lvlJc w:val="left"/>
+      <w:pPr>
+        <w:ind w:left="2880" w:hanging="480"/>
+      </w:pPr>
+    </w:lvl>
+    <w:lvl w:ilvl="4">
+      <w:numFmt w:val="bullet"/>
+      <w:lvlText w:val="•"/>
+      <w:lvlJc w:val="left"/>
+      <w:pPr>
+        <w:ind w:left="3600" w:hanging="480"/>
+      </w:pPr>
+    </w:lvl>
+    <w:lvl w:ilvl="5">
+      <w:numFmt w:val="bullet"/>
+      <w:lvlText w:val="–"/>
+      <w:lvlJc w:val="left"/>
+      <w:pPr>
+        <w:ind w:left="4320" w:hanging="480"/>
+      </w:pPr>
+    </w:lvl>
+    <w:lvl w:ilvl="6">
+      <w:numFmt w:val="bullet"/>
+      <w:lvlText w:val="•"/>
+      <w:lvlJc w:val="left"/>
+      <w:pPr>
+        <w:ind w:left="5040" w:hanging="480"/>
+      </w:pPr>
+    </w:lvl>
+    <w:lvl w:ilvl="7">
+      <w:numFmt w:val="bullet"/>
+      <w:lvlText w:val="–"/>
+      <w:lvlJc w:val="left"/>
+      <w:pPr>
+        <w:ind w:left="5760" w:hanging="480"/>
+      </w:pPr>
+    </w:lvl>
+    <w:lvl w:ilvl="8">
+      <w:numFmt w:val="bullet"/>
+      <w:lvlText w:val="•"/>
+      <w:lvlJc w:val="left"/>
+      <w:pPr>
+        <w:ind w:left="6480" w:hanging="480"/>
+      </w:pPr>
+    </w:lvl>
+  </w:abstractNum>
   <w:num w:numId="1000">
     <w:abstractNumId w:val="990"/>
+  </w:num>
+  <w:num w:numId="1001">
+    <w:abstractNumId w:val="991"/>
   </w:num>
 </w:numbering>
 </file>

</xml_diff>